<commit_message>
update week 05 gdb
</commit_message>
<xml_diff>
--- a/docs/Labs/Lab04/Lab04.docx
+++ b/docs/Labs/Lab04/Lab04.docx
@@ -4,22 +4,6 @@
   <w:body>
     <w:p>
       <w:pPr>
-        <w:jc w:val="both"/>
-        <w:rPr>
-          <w:rFonts w:ascii="Calibri" w:hAnsi="Calibri" w:cs="Calibri"/>
-          <w:sz w:val="24"/>
-        </w:rPr>
-      </w:pPr>
-      <w:r>
-        <w:rPr>
-          <w:rFonts w:ascii="Calibri" w:hAnsi="Calibri" w:cs="Calibri"/>
-          <w:sz w:val="24"/>
-        </w:rPr>
-        <w:t>7.4: Explore the desktop layout of a web experience</w:t>
-      </w:r>
-    </w:p>
-    <w:p>
-      <w:pPr>
         <w:jc w:val="center"/>
         <w:rPr>
           <w:rFonts w:ascii="Calibri" w:hAnsi="Calibri" w:cs="Calibri"/>
@@ -28,11 +12,35 @@
       </w:pPr>
       <w:r>
         <w:rPr>
-          <w:rFonts w:ascii="Calibri" w:hAnsi="Calibri" w:cs="Calibri"/>
+          <w:rFonts w:ascii="Calibri" w:hAnsi="Calibri" w:cs="Calibri" w:hint="eastAsia"/>
           <w:b/>
           <w:sz w:val="24"/>
         </w:rPr>
-        <w:t xml:space="preserve">Exercise 3: </w:t>
+        <w:t>E</w:t>
+      </w:r>
+      <w:r>
+        <w:rPr>
+          <w:rFonts w:ascii="Calibri" w:hAnsi="Calibri" w:cs="Calibri"/>
+          <w:b/>
+          <w:sz w:val="24"/>
+        </w:rPr>
+        <w:t xml:space="preserve">xercise </w:t>
+      </w:r>
+      <w:r>
+        <w:rPr>
+          <w:rFonts w:ascii="Calibri" w:hAnsi="Calibri" w:cs="Calibri" w:hint="eastAsia"/>
+          <w:b/>
+          <w:sz w:val="24"/>
+        </w:rPr>
+        <w:t>4</w:t>
+      </w:r>
+      <w:r>
+        <w:rPr>
+          <w:rFonts w:ascii="Calibri" w:hAnsi="Calibri" w:cs="Calibri"/>
+          <w:b/>
+          <w:sz w:val="24"/>
+        </w:rPr>
+        <w:t xml:space="preserve">: </w:t>
       </w:r>
       <w:r>
         <w:rPr>
@@ -68,7 +76,7 @@
           <w:sz w:val="24"/>
           <w:lang w:val="en"/>
         </w:rPr>
-        <w:t xml:space="preserve"> Midnight (11:59 pm) on</w:t>
+        <w:t xml:space="preserve"> Midnight (11:59 pm) on Thursday, Sep 25, 2025</w:t>
       </w:r>
       <w:r>
         <w:rPr>
@@ -76,49 +84,47 @@
           <w:sz w:val="24"/>
           <w:lang w:val="en"/>
         </w:rPr>
+        <w:t>,</w:t>
+      </w:r>
+      <w:r>
+        <w:rPr>
+          <w:rFonts w:ascii="Calibri" w:hAnsi="Calibri" w:cs="Calibri"/>
+          <w:sz w:val="24"/>
+          <w:lang w:val="en"/>
+        </w:rPr>
+        <w:t xml:space="preserve"> submitted as </w:t>
+      </w:r>
+      <w:r>
+        <w:rPr>
+          <w:rFonts w:ascii="Calibri" w:hAnsi="Calibri" w:cs="Calibri"/>
+          <w:sz w:val="24"/>
+          <w:lang w:val="en"/>
+        </w:rPr>
+        <w:t xml:space="preserve">a </w:t>
+      </w:r>
+      <w:r>
+        <w:rPr>
+          <w:rFonts w:ascii="Calibri" w:hAnsi="Calibri" w:cs="Calibri"/>
+          <w:sz w:val="24"/>
+          <w:lang w:val="en"/>
+        </w:rPr>
+        <w:t xml:space="preserve">Word document to </w:t>
+      </w:r>
+      <w:r>
+        <w:rPr>
+          <w:rFonts w:ascii="Calibri" w:hAnsi="Calibri" w:cs="Calibri"/>
+          <w:sz w:val="24"/>
+          <w:lang w:val="en"/>
+        </w:rPr>
+        <w:t>Blackboard</w:t>
+      </w:r>
+      <w:r>
+        <w:rPr>
+          <w:rFonts w:ascii="Calibri" w:hAnsi="Calibri" w:cs="Calibri"/>
+          <w:sz w:val="24"/>
+          <w:lang w:val="en"/>
+        </w:rPr>
         <w:t xml:space="preserve"> </w:t>
-      </w:r>
-      <w:r>
-        <w:rPr>
-          <w:rFonts w:ascii="Calibri" w:hAnsi="Calibri" w:cs="Calibri"/>
-          <w:sz w:val="24"/>
-          <w:lang w:val="en"/>
-        </w:rPr>
-        <w:t xml:space="preserve">Thursday, Sep </w:t>
-      </w:r>
-      <w:r>
-        <w:rPr>
-          <w:rFonts w:ascii="Calibri" w:hAnsi="Calibri" w:cs="Calibri"/>
-          <w:sz w:val="24"/>
-          <w:lang w:val="en"/>
-        </w:rPr>
-        <w:t>25</w:t>
-      </w:r>
-      <w:r>
-        <w:rPr>
-          <w:rFonts w:ascii="Calibri" w:hAnsi="Calibri" w:cs="Calibri"/>
-          <w:sz w:val="24"/>
-          <w:lang w:val="en"/>
-        </w:rPr>
-        <w:t xml:space="preserve">, </w:t>
-      </w:r>
-      <w:proofErr w:type="gramStart"/>
-      <w:r>
-        <w:rPr>
-          <w:rFonts w:ascii="Calibri" w:hAnsi="Calibri" w:cs="Calibri"/>
-          <w:sz w:val="24"/>
-          <w:lang w:val="en"/>
-        </w:rPr>
-        <w:t>2025</w:t>
-      </w:r>
-      <w:proofErr w:type="gramEnd"/>
-      <w:r>
-        <w:rPr>
-          <w:rFonts w:ascii="Calibri" w:hAnsi="Calibri" w:cs="Calibri"/>
-          <w:sz w:val="24"/>
-          <w:lang w:val="en"/>
-        </w:rPr>
-        <w:t xml:space="preserve"> submitted as Word document to blackboard </w:t>
       </w:r>
       <w:r>
         <w:rPr>
@@ -130,27 +136,15 @@
           <w:sz w:val="24"/>
           <w:lang w:val="en"/>
         </w:rPr>
-        <w:t>Lab0</w:t>
-      </w:r>
-      <w:r>
-        <w:rPr>
-          <w:rFonts w:ascii="Calibri" w:hAnsi="Calibri" w:cs="Calibri"/>
-          <w:b/>
-          <w:bCs/>
-          <w:i/>
-          <w:iCs/>
+        <w:t xml:space="preserve">Lab04 </w:t>
+      </w:r>
+      <w:r>
+        <w:rPr>
+          <w:rFonts w:ascii="Calibri" w:hAnsi="Calibri" w:cs="Calibri"/>
           <w:sz w:val="24"/>
           <w:lang w:val="en"/>
         </w:rPr>
-        <w:t xml:space="preserve">4 </w:t>
-      </w:r>
-      <w:r>
-        <w:rPr>
-          <w:rFonts w:ascii="Calibri" w:hAnsi="Calibri" w:cs="Calibri"/>
-          <w:sz w:val="24"/>
-          <w:lang w:val="en"/>
-        </w:rPr>
-        <w:t xml:space="preserve"> link</w:t>
+        <w:t>link</w:t>
       </w:r>
     </w:p>
     <w:p>
@@ -340,7 +334,7 @@
       <w:pPr>
         <w:jc w:val="both"/>
         <w:rPr>
-          <w:rFonts w:ascii="Calibri" w:hAnsi="Calibri" w:cs="Calibri" w:hint="eastAsia"/>
+          <w:rFonts w:ascii="Calibri" w:hAnsi="Calibri" w:cs="Calibri"/>
           <w:sz w:val="24"/>
         </w:rPr>
       </w:pPr>
@@ -869,6 +863,67 @@
     </w:p>
     <w:p>
       <w:pPr>
+        <w:pStyle w:val="Heading2"/>
+        <w:rPr>
+          <w:rFonts w:eastAsiaTheme="minorEastAsia"/>
+        </w:rPr>
+      </w:pPr>
+      <w:r>
+        <w:rPr>
+          <w:rFonts w:hint="eastAsia"/>
+        </w:rPr>
+        <w:t xml:space="preserve">Deliverable 1: Provide a screenshot of step 6 to show your selection. </w:t>
+      </w:r>
+    </w:p>
+    <w:p>
+      <w:pPr>
+        <w:rPr>
+          <w:rFonts w:hint="eastAsia"/>
+        </w:rPr>
+      </w:pPr>
+      <w:r>
+        <w:rPr>
+          <w:noProof/>
+        </w:rPr>
+        <w:drawing>
+          <wp:inline distT="0" distB="0" distL="0" distR="0" wp14:anchorId="4DDD7D79" wp14:editId="19C8D76C">
+            <wp:extent cx="5731510" cy="1613535"/>
+            <wp:effectExtent l="0" t="0" r="2540" b="5715"/>
+            <wp:docPr id="2022267329" name="Picture 1" descr="A screenshot of a computer&#10;&#10;AI-generated content may be incorrect."/>
+            <wp:cNvGraphicFramePr>
+              <a:graphicFrameLocks xmlns:a="http://schemas.openxmlformats.org/drawingml/2006/main" noChangeAspect="1"/>
+            </wp:cNvGraphicFramePr>
+            <a:graphic xmlns:a="http://schemas.openxmlformats.org/drawingml/2006/main">
+              <a:graphicData uri="http://schemas.openxmlformats.org/drawingml/2006/picture">
+                <pic:pic xmlns:pic="http://schemas.openxmlformats.org/drawingml/2006/picture">
+                  <pic:nvPicPr>
+                    <pic:cNvPr id="2022267329" name="Picture 1" descr="A screenshot of a computer&#10;&#10;AI-generated content may be incorrect."/>
+                    <pic:cNvPicPr/>
+                  </pic:nvPicPr>
+                  <pic:blipFill>
+                    <a:blip r:embed="rId9"/>
+                    <a:stretch>
+                      <a:fillRect/>
+                    </a:stretch>
+                  </pic:blipFill>
+                  <pic:spPr>
+                    <a:xfrm>
+                      <a:off x="0" y="0"/>
+                      <a:ext cx="5731510" cy="1613535"/>
+                    </a:xfrm>
+                    <a:prstGeom prst="rect">
+                      <a:avLst/>
+                    </a:prstGeom>
+                  </pic:spPr>
+                </pic:pic>
+              </a:graphicData>
+            </a:graphic>
+          </wp:inline>
+        </w:drawing>
+      </w:r>
+    </w:p>
+    <w:p>
+      <w:pPr>
         <w:pStyle w:val="ListParagraph"/>
         <w:numPr>
           <w:ilvl w:val="0"/>
@@ -937,6 +992,7 @@
           <w:rFonts w:ascii="Calibri" w:hAnsi="Calibri" w:cs="Calibri"/>
           <w:sz w:val="24"/>
         </w:rPr>
+        <w:lastRenderedPageBreak/>
         <w:t>Next, you will explore the different ways to edit the data using the Survey123 widget and the Edit widget.</w:t>
       </w:r>
     </w:p>
@@ -949,43 +1005,46 @@
         </w:numPr>
         <w:jc w:val="both"/>
         <w:rPr>
-          <w:rFonts w:ascii="Calibri" w:hAnsi="Calibri" w:cs="Calibri"/>
-          <w:sz w:val="24"/>
-        </w:rPr>
-      </w:pPr>
-      <w:r>
-        <w:rPr>
-          <w:rFonts w:ascii="Calibri" w:hAnsi="Calibri" w:cs="Calibri"/>
-          <w:sz w:val="24"/>
-        </w:rPr>
-        <w:t>Click the Edit Form tab.</w:t>
-      </w:r>
-    </w:p>
-    <w:p>
-      <w:pPr>
-        <w:pStyle w:val="ListParagraph"/>
-        <w:ind w:left="780"/>
-        <w:jc w:val="both"/>
-        <w:rPr>
-          <w:rFonts w:ascii="Calibri" w:hAnsi="Calibri" w:cs="Calibri"/>
-          <w:sz w:val="24"/>
-        </w:rPr>
-      </w:pPr>
+          <w:rFonts w:ascii="Calibri" w:hAnsi="Calibri" w:cs="Calibri" w:hint="eastAsia"/>
+          <w:sz w:val="24"/>
+        </w:rPr>
+      </w:pPr>
+      <w:r>
+        <w:rPr>
+          <w:rFonts w:ascii="Calibri" w:hAnsi="Calibri" w:cs="Calibri" w:hint="eastAsia"/>
+          <w:sz w:val="24"/>
+        </w:rPr>
+        <w:t xml:space="preserve">Randomly select </w:t>
+      </w:r>
+      <w:r>
+        <w:rPr>
+          <w:rFonts w:ascii="Calibri" w:hAnsi="Calibri" w:cs="Calibri"/>
+          <w:sz w:val="24"/>
+        </w:rPr>
+        <w:t>an</w:t>
+      </w:r>
+      <w:r>
+        <w:rPr>
+          <w:rFonts w:ascii="Calibri" w:hAnsi="Calibri" w:cs="Calibri" w:hint="eastAsia"/>
+          <w:sz w:val="24"/>
+        </w:rPr>
+        <w:t xml:space="preserve"> issue </w:t>
+      </w:r>
       <w:proofErr w:type="gramStart"/>
       <w:r>
         <w:rPr>
-          <w:rFonts w:ascii="Calibri" w:hAnsi="Calibri" w:cs="Calibri"/>
-          <w:sz w:val="24"/>
-        </w:rPr>
-        <w:t>A Survey123</w:t>
+          <w:rFonts w:ascii="Calibri" w:hAnsi="Calibri" w:cs="Calibri" w:hint="eastAsia"/>
+          <w:sz w:val="24"/>
+        </w:rPr>
+        <w:t>in</w:t>
       </w:r>
       <w:proofErr w:type="gramEnd"/>
       <w:r>
         <w:rPr>
-          <w:rFonts w:ascii="Calibri" w:hAnsi="Calibri" w:cs="Calibri"/>
-          <w:sz w:val="24"/>
-        </w:rPr>
-        <w:t xml:space="preserve"> form displays.</w:t>
+          <w:rFonts w:ascii="Calibri" w:hAnsi="Calibri" w:cs="Calibri" w:hint="eastAsia"/>
+          <w:sz w:val="24"/>
+        </w:rPr>
+        <w:t xml:space="preserve"> the left table. </w:t>
       </w:r>
     </w:p>
     <w:p>
@@ -1006,7 +1065,34 @@
           <w:rFonts w:ascii="Calibri" w:hAnsi="Calibri" w:cs="Calibri"/>
           <w:sz w:val="24"/>
         </w:rPr>
-        <w:t>On the form, scroll down to the repeat. Click the Add button to add a new status. Set the status as In Progress and click Submit.</w:t>
+        <w:t>Click the Edit Form tab.</w:t>
+      </w:r>
+    </w:p>
+    <w:p>
+      <w:pPr>
+        <w:pStyle w:val="ListParagraph"/>
+        <w:ind w:left="780"/>
+        <w:jc w:val="both"/>
+        <w:rPr>
+          <w:rFonts w:ascii="Calibri" w:hAnsi="Calibri" w:cs="Calibri"/>
+          <w:sz w:val="24"/>
+        </w:rPr>
+      </w:pPr>
+      <w:proofErr w:type="gramStart"/>
+      <w:r>
+        <w:rPr>
+          <w:rFonts w:ascii="Calibri" w:hAnsi="Calibri" w:cs="Calibri"/>
+          <w:sz w:val="24"/>
+        </w:rPr>
+        <w:t>A Survey123</w:t>
+      </w:r>
+      <w:proofErr w:type="gramEnd"/>
+      <w:r>
+        <w:rPr>
+          <w:rFonts w:ascii="Calibri" w:hAnsi="Calibri" w:cs="Calibri"/>
+          <w:sz w:val="24"/>
+        </w:rPr>
+        <w:t xml:space="preserve"> form displays.</w:t>
       </w:r>
     </w:p>
     <w:p>
@@ -1027,7 +1113,101 @@
           <w:rFonts w:ascii="Calibri" w:hAnsi="Calibri" w:cs="Calibri"/>
           <w:sz w:val="24"/>
         </w:rPr>
-        <w:t>In the Issue table, click Refresh to update the status of the issue.</w:t>
+        <w:t xml:space="preserve">On the form, </w:t>
+      </w:r>
+      <w:r>
+        <w:rPr>
+          <w:rFonts w:ascii="Calibri" w:hAnsi="Calibri" w:cs="Calibri"/>
+          <w:sz w:val="24"/>
+        </w:rPr>
+        <w:t>complete</w:t>
+      </w:r>
+      <w:r>
+        <w:rPr>
+          <w:rFonts w:ascii="Calibri" w:hAnsi="Calibri" w:cs="Calibri" w:hint="eastAsia"/>
+          <w:sz w:val="24"/>
+        </w:rPr>
+        <w:t xml:space="preserve"> the required information and</w:t>
+      </w:r>
+      <w:r>
+        <w:rPr>
+          <w:rFonts w:ascii="Calibri" w:hAnsi="Calibri" w:cs="Calibri"/>
+          <w:sz w:val="24"/>
+        </w:rPr>
+        <w:t xml:space="preserve"> click Submit.</w:t>
+      </w:r>
+    </w:p>
+    <w:p>
+      <w:pPr>
+        <w:pStyle w:val="Heading2"/>
+        <w:rPr>
+          <w:rFonts w:eastAsiaTheme="minorEastAsia"/>
+        </w:rPr>
+      </w:pPr>
+      <w:r>
+        <w:rPr>
+          <w:rFonts w:hint="eastAsia"/>
+        </w:rPr>
+        <w:t xml:space="preserve">Deliverable 2: Provide a screenshot of </w:t>
+      </w:r>
+      <w:r>
+        <w:t>‘</w:t>
+      </w:r>
+      <w:r>
+        <w:rPr>
+          <w:rFonts w:hint="eastAsia"/>
+        </w:rPr>
+        <w:t>Your Response was submitted successfully</w:t>
+      </w:r>
+      <w:r>
+        <w:t>’</w:t>
+      </w:r>
+    </w:p>
+    <w:p>
+      <w:pPr>
+        <w:rPr>
+          <w:rFonts w:hint="eastAsia"/>
+        </w:rPr>
+      </w:pPr>
+      <w:r>
+        <w:rPr>
+          <w:noProof/>
+        </w:rPr>
+        <w:drawing>
+          <wp:inline distT="0" distB="0" distL="0" distR="0" wp14:anchorId="0A1162C1" wp14:editId="73F40EE4">
+            <wp:extent cx="5731510" cy="2582545"/>
+            <wp:effectExtent l="0" t="0" r="2540" b="8255"/>
+            <wp:docPr id="1040383484" name="Picture 1" descr="A screenshot of a computer&#10;&#10;AI-generated content may be incorrect."/>
+            <wp:cNvGraphicFramePr>
+              <a:graphicFrameLocks xmlns:a="http://schemas.openxmlformats.org/drawingml/2006/main" noChangeAspect="1"/>
+            </wp:cNvGraphicFramePr>
+            <a:graphic xmlns:a="http://schemas.openxmlformats.org/drawingml/2006/main">
+              <a:graphicData uri="http://schemas.openxmlformats.org/drawingml/2006/picture">
+                <pic:pic xmlns:pic="http://schemas.openxmlformats.org/drawingml/2006/picture">
+                  <pic:nvPicPr>
+                    <pic:cNvPr id="1040383484" name="Picture 1" descr="A screenshot of a computer&#10;&#10;AI-generated content may be incorrect."/>
+                    <pic:cNvPicPr/>
+                  </pic:nvPicPr>
+                  <pic:blipFill>
+                    <a:blip r:embed="rId10"/>
+                    <a:stretch>
+                      <a:fillRect/>
+                    </a:stretch>
+                  </pic:blipFill>
+                  <pic:spPr>
+                    <a:xfrm>
+                      <a:off x="0" y="0"/>
+                      <a:ext cx="5731510" cy="2582545"/>
+                    </a:xfrm>
+                    <a:prstGeom prst="rect">
+                      <a:avLst/>
+                    </a:prstGeom>
+                  </pic:spPr>
+                </pic:pic>
+              </a:graphicData>
+            </a:graphic>
+          </wp:inline>
+        </w:drawing>
       </w:r>
     </w:p>
     <w:p>
@@ -1048,25 +1228,7 @@
           <w:rFonts w:ascii="Calibri" w:hAnsi="Calibri" w:cs="Calibri"/>
           <w:sz w:val="24"/>
         </w:rPr>
-        <w:t>Click the Edit widget.</w:t>
-      </w:r>
-    </w:p>
-    <w:p>
-      <w:pPr>
-        <w:pStyle w:val="ListParagraph"/>
-        <w:ind w:left="780"/>
-        <w:jc w:val="both"/>
-        <w:rPr>
-          <w:rFonts w:ascii="Calibri" w:hAnsi="Calibri" w:cs="Calibri"/>
-          <w:sz w:val="24"/>
-        </w:rPr>
-      </w:pPr>
-      <w:r>
-        <w:rPr>
-          <w:rFonts w:ascii="Calibri" w:hAnsi="Calibri" w:cs="Calibri"/>
-          <w:sz w:val="24"/>
-        </w:rPr>
-        <w:t>The Edit widget appears, configured to edit only attributes in this space, although it is capable of editing geometries as well.</w:t>
+        <w:t>In the Issue table, click Refresh to update the status of the issue.</w:t>
       </w:r>
     </w:p>
     <w:p>
@@ -1087,8 +1249,28 @@
           <w:rFonts w:ascii="Calibri" w:hAnsi="Calibri" w:cs="Calibri"/>
           <w:sz w:val="24"/>
         </w:rPr>
-        <w:lastRenderedPageBreak/>
-        <w:t>In the Edit widget, update the level of urgency and then click Update.</w:t>
+        <w:t>Randomly</w:t>
+      </w:r>
+      <w:r>
+        <w:rPr>
+          <w:rFonts w:ascii="Calibri" w:hAnsi="Calibri" w:cs="Calibri" w:hint="eastAsia"/>
+          <w:sz w:val="24"/>
+        </w:rPr>
+        <w:t xml:space="preserve"> select one </w:t>
+      </w:r>
+      <w:r>
+        <w:rPr>
+          <w:rFonts w:ascii="Calibri" w:hAnsi="Calibri" w:cs="Calibri"/>
+          <w:sz w:val="24"/>
+        </w:rPr>
+        <w:t>issue</w:t>
+      </w:r>
+      <w:r>
+        <w:rPr>
+          <w:rFonts w:ascii="Calibri" w:hAnsi="Calibri" w:cs="Calibri" w:hint="eastAsia"/>
+          <w:sz w:val="24"/>
+        </w:rPr>
+        <w:t xml:space="preserve"> from the left table.</w:t>
       </w:r>
     </w:p>
     <w:p>
@@ -1109,7 +1291,7 @@
           <w:rFonts w:ascii="Calibri" w:hAnsi="Calibri" w:cs="Calibri"/>
           <w:sz w:val="24"/>
         </w:rPr>
-        <w:t>In the Issue table, click Refresh.</w:t>
+        <w:t>Click the Edit widget.</w:t>
       </w:r>
     </w:p>
     <w:p>
@@ -1127,25 +1309,7 @@
           <w:rFonts w:ascii="Calibri" w:hAnsi="Calibri" w:cs="Calibri"/>
           <w:sz w:val="24"/>
         </w:rPr>
-        <w:t>The Level of Urgency of the issue has been updated.</w:t>
-      </w:r>
-    </w:p>
-    <w:p>
-      <w:pPr>
-        <w:pStyle w:val="ListParagraph"/>
-        <w:ind w:left="780"/>
-        <w:jc w:val="both"/>
-        <w:rPr>
-          <w:rFonts w:ascii="Calibri" w:hAnsi="Calibri" w:cs="Calibri"/>
-          <w:sz w:val="24"/>
-        </w:rPr>
-      </w:pPr>
-      <w:r>
-        <w:rPr>
-          <w:rFonts w:ascii="Calibri" w:hAnsi="Calibri" w:cs="Calibri"/>
-          <w:sz w:val="24"/>
-        </w:rPr>
-        <w:t>Next, you will explore how these functions are configured.</w:t>
+        <w:t>The Edit widget appears, configured to edit only attributes in this space, although it is capable of editing geometries as well.</w:t>
       </w:r>
     </w:p>
     <w:p>
@@ -1166,7 +1330,7 @@
           <w:rFonts w:ascii="Calibri" w:hAnsi="Calibri" w:cs="Calibri"/>
           <w:sz w:val="24"/>
         </w:rPr>
-        <w:t>Click the previous Browser tab to return to the configuration mode of the experience.</w:t>
+        <w:t>In the Edit widget, update the level of urgency and then click Update.</w:t>
       </w:r>
     </w:p>
     <w:p>
@@ -1187,7 +1351,7 @@
           <w:rFonts w:ascii="Calibri" w:hAnsi="Calibri" w:cs="Calibri"/>
           <w:sz w:val="24"/>
         </w:rPr>
-        <w:t>On the toolbar on the left, or left sidebar, click the Data button to display the Campus Issue Reviewer map in the app.</w:t>
+        <w:t>In the Issue table, click Refresh.</w:t>
       </w:r>
     </w:p>
     <w:p>
@@ -1205,7 +1369,25 @@
           <w:rFonts w:ascii="Calibri" w:hAnsi="Calibri" w:cs="Calibri"/>
           <w:sz w:val="24"/>
         </w:rPr>
-        <w:t>The web map has a Source button for you to review the web map’s item page with details if needed.</w:t>
+        <w:t>The Level of Urgency of the issue has been updated.</w:t>
+      </w:r>
+    </w:p>
+    <w:p>
+      <w:pPr>
+        <w:pStyle w:val="ListParagraph"/>
+        <w:ind w:left="780"/>
+        <w:jc w:val="both"/>
+        <w:rPr>
+          <w:rFonts w:ascii="Calibri" w:hAnsi="Calibri" w:cs="Calibri"/>
+          <w:sz w:val="24"/>
+        </w:rPr>
+      </w:pPr>
+      <w:r>
+        <w:rPr>
+          <w:rFonts w:ascii="Calibri" w:hAnsi="Calibri" w:cs="Calibri"/>
+          <w:sz w:val="24"/>
+        </w:rPr>
+        <w:t>Next, you will explore how these functions are configured.</w:t>
       </w:r>
     </w:p>
     <w:p>
@@ -1226,25 +1408,7 @@
           <w:rFonts w:ascii="Calibri" w:hAnsi="Calibri" w:cs="Calibri"/>
           <w:sz w:val="24"/>
         </w:rPr>
-        <w:t>On the left sidebar, click the Page button.</w:t>
-      </w:r>
-    </w:p>
-    <w:p>
-      <w:pPr>
-        <w:pStyle w:val="ListParagraph"/>
-        <w:ind w:left="780"/>
-        <w:jc w:val="both"/>
-        <w:rPr>
-          <w:rFonts w:ascii="Calibri" w:hAnsi="Calibri" w:cs="Calibri"/>
-          <w:sz w:val="24"/>
-        </w:rPr>
-      </w:pPr>
-      <w:r>
-        <w:rPr>
-          <w:rFonts w:ascii="Calibri" w:hAnsi="Calibri" w:cs="Calibri"/>
-          <w:sz w:val="24"/>
-        </w:rPr>
-        <w:t>This app has only one page. Its outline displays the header and the body, including all the widgets used in the app.</w:t>
+        <w:t>Click the previous Browser tab to return to the configuration mode of the experience.</w:t>
       </w:r>
     </w:p>
     <w:p>
@@ -1265,7 +1429,25 @@
           <w:rFonts w:ascii="Calibri" w:hAnsi="Calibri" w:cs="Calibri"/>
           <w:sz w:val="24"/>
         </w:rPr>
-        <w:t>On the Preview page, hover over the header and click Edit Header.</w:t>
+        <w:t>On the toolbar on the left, or left sidebar, click the Data button to display the Campus Issue Reviewer map in the app.</w:t>
+      </w:r>
+    </w:p>
+    <w:p>
+      <w:pPr>
+        <w:pStyle w:val="ListParagraph"/>
+        <w:ind w:left="780"/>
+        <w:jc w:val="both"/>
+        <w:rPr>
+          <w:rFonts w:ascii="Calibri" w:hAnsi="Calibri" w:cs="Calibri"/>
+          <w:sz w:val="24"/>
+        </w:rPr>
+      </w:pPr>
+      <w:r>
+        <w:rPr>
+          <w:rFonts w:ascii="Calibri" w:hAnsi="Calibri" w:cs="Calibri"/>
+          <w:sz w:val="24"/>
+        </w:rPr>
+        <w:t>The web map has a Source button for you to review the web map’s item page with details if needed.</w:t>
       </w:r>
     </w:p>
     <w:p>
@@ -1286,7 +1468,7 @@
           <w:rFonts w:ascii="Calibri" w:hAnsi="Calibri" w:cs="Calibri"/>
           <w:sz w:val="24"/>
         </w:rPr>
-        <w:t>Click the Status and Issue Type filter.</w:t>
+        <w:t>On the left sidebar, click the Page button.</w:t>
       </w:r>
     </w:p>
     <w:p>
@@ -1304,7 +1486,7 @@
           <w:rFonts w:ascii="Calibri" w:hAnsi="Calibri" w:cs="Calibri"/>
           <w:sz w:val="24"/>
         </w:rPr>
-        <w:t>Its settings appear on the right side. It is configured to use the Issues layer.</w:t>
+        <w:t>This app has only one page. Its outline displays the header and the body, including all the widgets used in the app.</w:t>
       </w:r>
     </w:p>
     <w:p>
@@ -1325,7 +1507,8 @@
           <w:rFonts w:ascii="Calibri" w:hAnsi="Calibri" w:cs="Calibri"/>
           <w:sz w:val="24"/>
         </w:rPr>
-        <w:t>Click the Issues filter.</w:t>
+        <w:lastRenderedPageBreak/>
+        <w:t>On the Preview page, hover over the header and click Edit Header.</w:t>
       </w:r>
     </w:p>
     <w:p>
@@ -1341,21 +1524,12 @@
           <w:sz w:val="24"/>
         </w:rPr>
       </w:pPr>
-      <w:proofErr w:type="gramStart"/>
-      <w:r>
-        <w:rPr>
-          <w:rFonts w:ascii="Calibri" w:hAnsi="Calibri" w:cs="Calibri"/>
-          <w:sz w:val="24"/>
-        </w:rPr>
-        <w:t>Click</w:t>
-      </w:r>
-      <w:proofErr w:type="gramEnd"/>
-      <w:r>
-        <w:rPr>
-          <w:rFonts w:ascii="Calibri" w:hAnsi="Calibri" w:cs="Calibri"/>
-          <w:sz w:val="24"/>
-        </w:rPr>
-        <w:t xml:space="preserve"> SQL Expression Builder and review how the filter is configured on the Status and Issue Type fields.</w:t>
+      <w:r>
+        <w:rPr>
+          <w:rFonts w:ascii="Calibri" w:hAnsi="Calibri" w:cs="Calibri"/>
+          <w:sz w:val="24"/>
+        </w:rPr>
+        <w:t>Click the Status and Issue Type filter.</w:t>
       </w:r>
     </w:p>
     <w:p>
@@ -1373,7 +1547,7 @@
           <w:rFonts w:ascii="Calibri" w:hAnsi="Calibri" w:cs="Calibri"/>
           <w:sz w:val="24"/>
         </w:rPr>
-        <w:t>Because it filters the Issues layer, the filter affects all the widgets using this layer, including the number of issues, the chart, the table, and the map.</w:t>
+        <w:t>Its settings appear on the right side. It is configured to use the Issues layer.</w:t>
       </w:r>
     </w:p>
     <w:p>
@@ -1394,7 +1568,7 @@
           <w:rFonts w:ascii="Calibri" w:hAnsi="Calibri" w:cs="Calibri"/>
           <w:sz w:val="24"/>
         </w:rPr>
-        <w:t>Click Cancel.</w:t>
+        <w:t>Click the Issues filter.</w:t>
       </w:r>
     </w:p>
     <w:p>
@@ -1410,12 +1584,21 @@
           <w:sz w:val="24"/>
         </w:rPr>
       </w:pPr>
-      <w:r>
-        <w:rPr>
-          <w:rFonts w:ascii="Calibri" w:hAnsi="Calibri" w:cs="Calibri"/>
-          <w:sz w:val="24"/>
-        </w:rPr>
-        <w:t>In the Page view, click the Issue table to open the Issue Table settings. Click Action.</w:t>
+      <w:proofErr w:type="gramStart"/>
+      <w:r>
+        <w:rPr>
+          <w:rFonts w:ascii="Calibri" w:hAnsi="Calibri" w:cs="Calibri"/>
+          <w:sz w:val="24"/>
+        </w:rPr>
+        <w:t>Click</w:t>
+      </w:r>
+      <w:proofErr w:type="gramEnd"/>
+      <w:r>
+        <w:rPr>
+          <w:rFonts w:ascii="Calibri" w:hAnsi="Calibri" w:cs="Calibri"/>
+          <w:sz w:val="24"/>
+        </w:rPr>
+        <w:t xml:space="preserve"> SQL Expression Builder and review how the filter is configured on the Status and Issue Type fields.</w:t>
       </w:r>
     </w:p>
     <w:p>
@@ -1433,75 +1616,7 @@
           <w:rFonts w:ascii="Calibri" w:hAnsi="Calibri" w:cs="Calibri"/>
           <w:sz w:val="24"/>
         </w:rPr>
-        <w:t xml:space="preserve">Under Message Action, when a record is clicked or selected in the table, the map pans </w:t>
-      </w:r>
-      <w:proofErr w:type="gramStart"/>
-      <w:r>
-        <w:rPr>
-          <w:rFonts w:ascii="Calibri" w:hAnsi="Calibri" w:cs="Calibri"/>
-          <w:sz w:val="24"/>
-        </w:rPr>
-        <w:t>to</w:t>
-      </w:r>
-      <w:proofErr w:type="gramEnd"/>
-      <w:r>
-        <w:rPr>
-          <w:rFonts w:ascii="Calibri" w:hAnsi="Calibri" w:cs="Calibri"/>
-          <w:sz w:val="24"/>
-        </w:rPr>
-        <w:t>, zooms to, and flashes the selected record.</w:t>
-      </w:r>
-    </w:p>
-    <w:p>
-      <w:pPr>
-        <w:pStyle w:val="ListParagraph"/>
-        <w:ind w:left="780"/>
-        <w:jc w:val="both"/>
-        <w:rPr>
-          <w:rFonts w:ascii="Calibri" w:hAnsi="Calibri" w:cs="Calibri"/>
-          <w:sz w:val="24"/>
-        </w:rPr>
-      </w:pPr>
-      <w:r>
-        <w:rPr>
-          <w:rFonts w:ascii="Calibri" w:hAnsi="Calibri" w:cs="Calibri"/>
-          <w:sz w:val="24"/>
-        </w:rPr>
-        <w:t xml:space="preserve">Clicking a record </w:t>
-      </w:r>
-      <w:proofErr w:type="gramStart"/>
-      <w:r>
-        <w:rPr>
-          <w:rFonts w:ascii="Calibri" w:hAnsi="Calibri" w:cs="Calibri"/>
-          <w:sz w:val="24"/>
-        </w:rPr>
-        <w:t>in</w:t>
-      </w:r>
-      <w:proofErr w:type="gramEnd"/>
-      <w:r>
-        <w:rPr>
-          <w:rFonts w:ascii="Calibri" w:hAnsi="Calibri" w:cs="Calibri"/>
-          <w:sz w:val="24"/>
-        </w:rPr>
-        <w:t xml:space="preserve"> the table selects the record. The selected record is passed to the Feature Info, Survey, and Edit widgets.</w:t>
-      </w:r>
-    </w:p>
-    <w:p>
-      <w:pPr>
-        <w:pStyle w:val="ListParagraph"/>
-        <w:ind w:left="780"/>
-        <w:jc w:val="both"/>
-        <w:rPr>
-          <w:rFonts w:ascii="Calibri" w:hAnsi="Calibri" w:cs="Calibri"/>
-          <w:sz w:val="24"/>
-        </w:rPr>
-      </w:pPr>
-      <w:r>
-        <w:rPr>
-          <w:rFonts w:ascii="Calibri" w:hAnsi="Calibri" w:cs="Calibri"/>
-          <w:sz w:val="24"/>
-        </w:rPr>
-        <w:t>Next, you will explore how the Edit Form section is configured.</w:t>
+        <w:t>Because it filters the Issues layer, the filter affects all the widgets using this layer, including the number of issues, the chart, the table, and the map.</w:t>
       </w:r>
     </w:p>
     <w:p>
@@ -1522,25 +1637,7 @@
           <w:rFonts w:ascii="Calibri" w:hAnsi="Calibri" w:cs="Calibri"/>
           <w:sz w:val="24"/>
         </w:rPr>
-        <w:t>In the Page outline, expand Section, expand the Edit Form view, and click the Survey widget.</w:t>
-      </w:r>
-    </w:p>
-    <w:p>
-      <w:pPr>
-        <w:pStyle w:val="ListParagraph"/>
-        <w:ind w:left="780"/>
-        <w:jc w:val="both"/>
-        <w:rPr>
-          <w:rFonts w:ascii="Calibri" w:hAnsi="Calibri" w:cs="Calibri"/>
-          <w:sz w:val="24"/>
-        </w:rPr>
-      </w:pPr>
-      <w:r>
-        <w:rPr>
-          <w:rFonts w:ascii="Calibri" w:hAnsi="Calibri" w:cs="Calibri"/>
-          <w:sz w:val="24"/>
-        </w:rPr>
-        <w:t>In the Survey widget settings, the mode is set to Edit an Existing Record. Its source layer is set to the Issues layer, which means that this widget is configured to receive data from the layer when an issue is selected.</w:t>
+        <w:t>Click Cancel.</w:t>
       </w:r>
     </w:p>
     <w:p>
@@ -1561,6 +1658,152 @@
           <w:rFonts w:ascii="Calibri" w:hAnsi="Calibri" w:cs="Calibri"/>
           <w:sz w:val="24"/>
         </w:rPr>
+        <w:t>In the Page view, click the Issue table to open the Issue Table settings. Click Action.</w:t>
+      </w:r>
+    </w:p>
+    <w:p>
+      <w:pPr>
+        <w:pStyle w:val="ListParagraph"/>
+        <w:ind w:left="780"/>
+        <w:jc w:val="both"/>
+        <w:rPr>
+          <w:rFonts w:ascii="Calibri" w:hAnsi="Calibri" w:cs="Calibri"/>
+          <w:sz w:val="24"/>
+        </w:rPr>
+      </w:pPr>
+      <w:r>
+        <w:rPr>
+          <w:rFonts w:ascii="Calibri" w:hAnsi="Calibri" w:cs="Calibri"/>
+          <w:sz w:val="24"/>
+        </w:rPr>
+        <w:t xml:space="preserve">Under Message Action, when a record is clicked or selected in the table, the map pans </w:t>
+      </w:r>
+      <w:proofErr w:type="gramStart"/>
+      <w:r>
+        <w:rPr>
+          <w:rFonts w:ascii="Calibri" w:hAnsi="Calibri" w:cs="Calibri"/>
+          <w:sz w:val="24"/>
+        </w:rPr>
+        <w:t>to</w:t>
+      </w:r>
+      <w:proofErr w:type="gramEnd"/>
+      <w:r>
+        <w:rPr>
+          <w:rFonts w:ascii="Calibri" w:hAnsi="Calibri" w:cs="Calibri"/>
+          <w:sz w:val="24"/>
+        </w:rPr>
+        <w:t>, zooms to, and flashes the selected record.</w:t>
+      </w:r>
+    </w:p>
+    <w:p>
+      <w:pPr>
+        <w:pStyle w:val="ListParagraph"/>
+        <w:ind w:left="780"/>
+        <w:jc w:val="both"/>
+        <w:rPr>
+          <w:rFonts w:ascii="Calibri" w:hAnsi="Calibri" w:cs="Calibri"/>
+          <w:sz w:val="24"/>
+        </w:rPr>
+      </w:pPr>
+      <w:r>
+        <w:rPr>
+          <w:rFonts w:ascii="Calibri" w:hAnsi="Calibri" w:cs="Calibri"/>
+          <w:sz w:val="24"/>
+        </w:rPr>
+        <w:t xml:space="preserve">Clicking a record </w:t>
+      </w:r>
+      <w:proofErr w:type="gramStart"/>
+      <w:r>
+        <w:rPr>
+          <w:rFonts w:ascii="Calibri" w:hAnsi="Calibri" w:cs="Calibri"/>
+          <w:sz w:val="24"/>
+        </w:rPr>
+        <w:t>in</w:t>
+      </w:r>
+      <w:proofErr w:type="gramEnd"/>
+      <w:r>
+        <w:rPr>
+          <w:rFonts w:ascii="Calibri" w:hAnsi="Calibri" w:cs="Calibri"/>
+          <w:sz w:val="24"/>
+        </w:rPr>
+        <w:t xml:space="preserve"> the table selects the record. The selected record is passed to the Feature Info, Survey, and Edit widgets.</w:t>
+      </w:r>
+    </w:p>
+    <w:p>
+      <w:pPr>
+        <w:pStyle w:val="ListParagraph"/>
+        <w:ind w:left="780"/>
+        <w:jc w:val="both"/>
+        <w:rPr>
+          <w:rFonts w:ascii="Calibri" w:hAnsi="Calibri" w:cs="Calibri"/>
+          <w:sz w:val="24"/>
+        </w:rPr>
+      </w:pPr>
+      <w:r>
+        <w:rPr>
+          <w:rFonts w:ascii="Calibri" w:hAnsi="Calibri" w:cs="Calibri"/>
+          <w:sz w:val="24"/>
+        </w:rPr>
+        <w:t>Next, you will explore how the Edit Form section is configured.</w:t>
+      </w:r>
+    </w:p>
+    <w:p>
+      <w:pPr>
+        <w:pStyle w:val="ListParagraph"/>
+        <w:numPr>
+          <w:ilvl w:val="0"/>
+          <w:numId w:val="6"/>
+        </w:numPr>
+        <w:jc w:val="both"/>
+        <w:rPr>
+          <w:rFonts w:ascii="Calibri" w:hAnsi="Calibri" w:cs="Calibri"/>
+          <w:sz w:val="24"/>
+        </w:rPr>
+      </w:pPr>
+      <w:r>
+        <w:rPr>
+          <w:rFonts w:ascii="Calibri" w:hAnsi="Calibri" w:cs="Calibri"/>
+          <w:sz w:val="24"/>
+        </w:rPr>
+        <w:t>In the Page outline, expand Section, expand the Edit Form view, and click the Survey widget.</w:t>
+      </w:r>
+    </w:p>
+    <w:p>
+      <w:pPr>
+        <w:pStyle w:val="ListParagraph"/>
+        <w:ind w:left="780"/>
+        <w:jc w:val="both"/>
+        <w:rPr>
+          <w:rFonts w:ascii="Calibri" w:hAnsi="Calibri" w:cs="Calibri"/>
+          <w:sz w:val="24"/>
+        </w:rPr>
+      </w:pPr>
+      <w:r>
+        <w:rPr>
+          <w:rFonts w:ascii="Calibri" w:hAnsi="Calibri" w:cs="Calibri"/>
+          <w:sz w:val="24"/>
+        </w:rPr>
+        <w:t>In the Survey widget settings, the mode is set to Edit an Existing Record. Its source layer is set to the Issues layer, which means that this widget is configured to receive data from the layer when an issue is selected.</w:t>
+      </w:r>
+    </w:p>
+    <w:p>
+      <w:pPr>
+        <w:pStyle w:val="ListParagraph"/>
+        <w:numPr>
+          <w:ilvl w:val="0"/>
+          <w:numId w:val="6"/>
+        </w:numPr>
+        <w:jc w:val="both"/>
+        <w:rPr>
+          <w:rFonts w:ascii="Calibri" w:hAnsi="Calibri" w:cs="Calibri"/>
+          <w:sz w:val="24"/>
+        </w:rPr>
+      </w:pPr>
+      <w:r>
+        <w:rPr>
+          <w:rFonts w:ascii="Calibri" w:hAnsi="Calibri" w:cs="Calibri"/>
+          <w:sz w:val="24"/>
+        </w:rPr>
         <w:t xml:space="preserve">If you </w:t>
       </w:r>
       <w:proofErr w:type="gramStart"/>
@@ -1618,7 +1861,6 @@
           <w:rFonts w:ascii="Calibri" w:hAnsi="Calibri" w:cs="Calibri" w:hint="eastAsia"/>
           <w:sz w:val="24"/>
         </w:rPr>
-        <w:lastRenderedPageBreak/>
         <w:t xml:space="preserve">Section 2: </w:t>
       </w:r>
       <w:r>
@@ -1832,7 +2074,7 @@
       <w:pPr>
         <w:pStyle w:val="NormalWeb"/>
         <w:rPr>
-          <w:rFonts w:eastAsiaTheme="minorEastAsia" w:hint="eastAsia"/>
+          <w:rFonts w:eastAsiaTheme="minorEastAsia"/>
         </w:rPr>
       </w:pPr>
       <w:r>
@@ -1858,6 +2100,7 @@
         <w:rPr>
           <w:rFonts w:eastAsiaTheme="minorEastAsia" w:hint="eastAsia"/>
         </w:rPr>
+        <w:lastRenderedPageBreak/>
         <w:t xml:space="preserve">Deliverable 2: </w:t>
       </w:r>
       <w:r>
@@ -1988,29 +2231,71 @@
       <w:pPr>
         <w:jc w:val="both"/>
         <w:rPr>
+          <w:rFonts w:ascii="Calibri" w:hAnsi="Calibri" w:cs="Calibri"/>
+          <w:sz w:val="24"/>
+        </w:rPr>
+      </w:pPr>
+      <w:r>
+        <w:rPr>
           <w:rFonts w:ascii="Calibri" w:hAnsi="Calibri" w:cs="Calibri" w:hint="eastAsia"/>
           <w:sz w:val="24"/>
         </w:rPr>
-      </w:pPr>
+        <w:t xml:space="preserve">Deliverable 2: </w:t>
+      </w:r>
       <w:r>
         <w:rPr>
           <w:rFonts w:ascii="Calibri" w:hAnsi="Calibri" w:cs="Calibri" w:hint="eastAsia"/>
           <w:sz w:val="24"/>
         </w:rPr>
-        <w:t xml:space="preserve">Deliverable 2: </w:t>
+        <w:t>Submit your</w:t>
       </w:r>
       <w:r>
         <w:rPr>
           <w:rFonts w:ascii="Calibri" w:hAnsi="Calibri" w:cs="Calibri" w:hint="eastAsia"/>
           <w:sz w:val="24"/>
         </w:rPr>
-        <w:t>Submit your</w:t>
+        <w:t xml:space="preserve"> </w:t>
       </w:r>
       <w:r>
         <w:rPr>
           <w:rFonts w:ascii="Calibri" w:hAnsi="Calibri" w:cs="Calibri" w:hint="eastAsia"/>
           <w:sz w:val="24"/>
         </w:rPr>
+        <w:t>HTML file</w:t>
+      </w:r>
+      <w:r>
+        <w:rPr>
+          <w:rFonts w:ascii="Calibri" w:hAnsi="Calibri" w:cs="Calibri" w:hint="eastAsia"/>
+          <w:sz w:val="24"/>
+        </w:rPr>
+        <w:t xml:space="preserve"> to </w:t>
+      </w:r>
+      <w:r>
+        <w:rPr>
+          <w:rFonts w:ascii="Calibri" w:hAnsi="Calibri" w:cs="Calibri" w:hint="eastAsia"/>
+          <w:sz w:val="24"/>
+        </w:rPr>
+        <w:t xml:space="preserve">the </w:t>
+      </w:r>
+      <w:r>
+        <w:rPr>
+          <w:rFonts w:ascii="Calibri" w:hAnsi="Calibri" w:cs="Calibri" w:hint="eastAsia"/>
+          <w:sz w:val="24"/>
+        </w:rPr>
+        <w:t>lab link</w:t>
+      </w:r>
+      <w:r>
+        <w:rPr>
+          <w:rFonts w:ascii="Calibri" w:hAnsi="Calibri" w:cs="Calibri" w:hint="eastAsia"/>
+          <w:sz w:val="24"/>
+        </w:rPr>
+        <w:t>.</w:t>
+      </w:r>
+      <w:r>
+        <w:rPr>
+          <w:rFonts w:ascii="Calibri" w:hAnsi="Calibri" w:cs="Calibri" w:hint="eastAsia"/>
+          <w:sz w:val="24"/>
+        </w:rPr>
         <w:t xml:space="preserve"> </w:t>
       </w:r>
       <w:r>
@@ -2018,36 +2303,54 @@
           <w:rFonts w:ascii="Calibri" w:hAnsi="Calibri" w:cs="Calibri" w:hint="eastAsia"/>
           <w:sz w:val="24"/>
         </w:rPr>
-        <w:t>HTML file</w:t>
+        <w:t>M</w:t>
       </w:r>
       <w:r>
         <w:rPr>
           <w:rFonts w:ascii="Calibri" w:hAnsi="Calibri" w:cs="Calibri" w:hint="eastAsia"/>
           <w:sz w:val="24"/>
         </w:rPr>
-        <w:t xml:space="preserve"> to </w:t>
+        <w:t xml:space="preserve">ake sure </w:t>
       </w:r>
       <w:r>
         <w:rPr>
           <w:rFonts w:ascii="Calibri" w:hAnsi="Calibri" w:cs="Calibri" w:hint="eastAsia"/>
           <w:sz w:val="24"/>
         </w:rPr>
-        <w:t xml:space="preserve">the </w:t>
-      </w:r>
+        <w:t xml:space="preserve">the file opens </w:t>
+      </w:r>
+      <w:proofErr w:type="gramStart"/>
       <w:r>
         <w:rPr>
           <w:rFonts w:ascii="Calibri" w:hAnsi="Calibri" w:cs="Calibri" w:hint="eastAsia"/>
           <w:sz w:val="24"/>
         </w:rPr>
-        <w:t>lab link</w:t>
-      </w:r>
+        <w:t>properly</w:t>
+      </w:r>
+      <w:proofErr w:type="gramEnd"/>
       <w:r>
         <w:rPr>
           <w:rFonts w:ascii="Calibri" w:hAnsi="Calibri" w:cs="Calibri" w:hint="eastAsia"/>
           <w:sz w:val="24"/>
         </w:rPr>
+        <w:t xml:space="preserve"> and the map is </w:t>
+      </w:r>
+      <w:proofErr w:type="gramStart"/>
+      <w:r>
+        <w:rPr>
+          <w:rFonts w:ascii="Calibri" w:hAnsi="Calibri" w:cs="Calibri" w:hint="eastAsia"/>
+          <w:sz w:val="24"/>
+        </w:rPr>
+        <w:t>displayed.</w:t>
+      </w:r>
+      <w:r>
+        <w:rPr>
+          <w:rFonts w:ascii="Calibri" w:hAnsi="Calibri" w:cs="Calibri" w:hint="eastAsia"/>
+          <w:sz w:val="24"/>
+        </w:rPr>
         <w:t>.</w:t>
       </w:r>
+      <w:proofErr w:type="gramEnd"/>
       <w:r>
         <w:rPr>
           <w:rFonts w:ascii="Calibri" w:hAnsi="Calibri" w:cs="Calibri" w:hint="eastAsia"/>
@@ -2055,72 +2358,12 @@
         </w:rPr>
         <w:t xml:space="preserve"> </w:t>
       </w:r>
-      <w:r>
-        <w:rPr>
-          <w:rFonts w:ascii="Calibri" w:hAnsi="Calibri" w:cs="Calibri" w:hint="eastAsia"/>
-          <w:sz w:val="24"/>
-        </w:rPr>
-        <w:t>M</w:t>
-      </w:r>
-      <w:r>
-        <w:rPr>
-          <w:rFonts w:ascii="Calibri" w:hAnsi="Calibri" w:cs="Calibri" w:hint="eastAsia"/>
-          <w:sz w:val="24"/>
-        </w:rPr>
-        <w:t xml:space="preserve">ake sure </w:t>
-      </w:r>
-      <w:r>
-        <w:rPr>
-          <w:rFonts w:ascii="Calibri" w:hAnsi="Calibri" w:cs="Calibri" w:hint="eastAsia"/>
-          <w:sz w:val="24"/>
-        </w:rPr>
-        <w:t xml:space="preserve">the file opens </w:t>
-      </w:r>
-      <w:proofErr w:type="gramStart"/>
-      <w:r>
-        <w:rPr>
-          <w:rFonts w:ascii="Calibri" w:hAnsi="Calibri" w:cs="Calibri" w:hint="eastAsia"/>
-          <w:sz w:val="24"/>
-        </w:rPr>
-        <w:t>properly</w:t>
-      </w:r>
-      <w:proofErr w:type="gramEnd"/>
-      <w:r>
-        <w:rPr>
-          <w:rFonts w:ascii="Calibri" w:hAnsi="Calibri" w:cs="Calibri" w:hint="eastAsia"/>
-          <w:sz w:val="24"/>
-        </w:rPr>
-        <w:t xml:space="preserve"> and the map is </w:t>
-      </w:r>
-      <w:proofErr w:type="gramStart"/>
-      <w:r>
-        <w:rPr>
-          <w:rFonts w:ascii="Calibri" w:hAnsi="Calibri" w:cs="Calibri" w:hint="eastAsia"/>
-          <w:sz w:val="24"/>
-        </w:rPr>
-        <w:t>displayed.</w:t>
-      </w:r>
-      <w:r>
-        <w:rPr>
-          <w:rFonts w:ascii="Calibri" w:hAnsi="Calibri" w:cs="Calibri" w:hint="eastAsia"/>
-          <w:sz w:val="24"/>
-        </w:rPr>
-        <w:t>.</w:t>
-      </w:r>
-      <w:proofErr w:type="gramEnd"/>
-      <w:r>
-        <w:rPr>
-          <w:rFonts w:ascii="Calibri" w:hAnsi="Calibri" w:cs="Calibri" w:hint="eastAsia"/>
-          <w:sz w:val="24"/>
-        </w:rPr>
-        <w:t xml:space="preserve"> </w:t>
-      </w:r>
-    </w:p>
-    <w:p>
-      <w:pPr>
-        <w:jc w:val="both"/>
-        <w:rPr>
-          <w:rFonts w:ascii="Calibri" w:hAnsi="Calibri" w:cs="Calibri" w:hint="eastAsia"/>
+    </w:p>
+    <w:p>
+      <w:pPr>
+        <w:jc w:val="both"/>
+        <w:rPr>
+          <w:rFonts w:ascii="Calibri" w:hAnsi="Calibri" w:cs="Calibri"/>
           <w:sz w:val="24"/>
         </w:rPr>
       </w:pPr>
@@ -2926,7 +3169,7 @@
   <w:abstractNum w:abstractNumId="6" w15:restartNumberingAfterBreak="0">
     <w:nsid w:val="474263E2"/>
     <w:multiLevelType w:val="hybridMultilevel"/>
-    <w:tmpl w:val="05AAA814"/>
+    <w:tmpl w:val="626404A0"/>
     <w:lvl w:ilvl="0" w:tplc="E158A6D4">
       <w:start w:val="6"/>
       <w:numFmt w:val="decimal"/>
@@ -4165,10 +4408,9 @@
     <w:next w:val="Normal"/>
     <w:link w:val="Heading2Char"/>
     <w:uiPriority w:val="9"/>
-    <w:semiHidden/>
     <w:unhideWhenUsed/>
     <w:qFormat/>
-    <w:rsid w:val="009A2858"/>
+    <w:rsid w:val="005D77DA"/>
     <w:pPr>
       <w:keepNext/>
       <w:keepLines/>
@@ -4176,9 +4418,9 @@
       <w:outlineLvl w:val="1"/>
     </w:pPr>
     <w:rPr>
-      <w:rFonts w:asciiTheme="majorHAnsi" w:eastAsiaTheme="majorEastAsia" w:hAnsiTheme="majorHAnsi" w:cstheme="majorBidi"/>
-      <w:color w:val="0F4761" w:themeColor="accent1" w:themeShade="BF"/>
-      <w:sz w:val="40"/>
+      <w:rFonts w:asciiTheme="majorHAnsi" w:eastAsia="Calibri" w:hAnsiTheme="majorHAnsi" w:cstheme="majorBidi"/>
+      <w:color w:val="EE0000"/>
+      <w:sz w:val="24"/>
       <w:szCs w:val="40"/>
     </w:rPr>
   </w:style>
@@ -4341,6 +4583,7 @@
   <w:style w:type="character" w:default="1" w:styleId="DefaultParagraphFont">
     <w:name w:val="Default Paragraph Font"/>
     <w:uiPriority w:val="1"/>
+    <w:semiHidden/>
     <w:unhideWhenUsed/>
   </w:style>
   <w:style w:type="table" w:default="1" w:styleId="TableNormal">
@@ -4389,12 +4632,11 @@
     <w:basedOn w:val="DefaultParagraphFont"/>
     <w:link w:val="Heading2"/>
     <w:uiPriority w:val="9"/>
-    <w:semiHidden/>
-    <w:rsid w:val="009A2858"/>
+    <w:rsid w:val="005D77DA"/>
     <w:rPr>
-      <w:rFonts w:asciiTheme="majorHAnsi" w:eastAsiaTheme="majorEastAsia" w:hAnsiTheme="majorHAnsi" w:cstheme="majorBidi"/>
-      <w:color w:val="0F4761" w:themeColor="accent1" w:themeShade="BF"/>
-      <w:sz w:val="40"/>
+      <w:rFonts w:asciiTheme="majorHAnsi" w:eastAsia="Calibri" w:hAnsiTheme="majorHAnsi" w:cstheme="majorBidi"/>
+      <w:color w:val="EE0000"/>
+      <w:sz w:val="24"/>
       <w:szCs w:val="40"/>
     </w:rPr>
   </w:style>

</xml_diff>